<commit_message>
Restore case introduction as section 1 (story, two tiers, three periods); renumber sections 2-7
</commit_message>
<xml_diff>
--- a/Nomade_Vans_Case_v3.0_Simulator_Edition_2026-04-23.docx
+++ b/Nomade_Vans_Case_v3.0_Simulator_Edition_2026-04-23.docx
@@ -80,7 +80,119 @@
         <w:rPr>
           <w:color w:val="0F172A"/>
         </w:rPr>
-        <w:t>1. Company summary</w:t>
+        <w:t>1. The case — Nomade Vans</w:t>
+      </w:r>
+    </w:p>
+    <w:p>
+      <w:r>
+        <w:rPr>
+          <w:b w:val="0"/>
+          <w:i w:val="0"/>
+          <w:sz w:val="22"/>
+        </w:rPr>
+        <w:t>Nomade Vans is a Spanish company focused on the design and "camperization" of sustainable vans. Customers configure their vehicle through the company website and the firm commits to a one-month delivery. Unlike most players in the category, Nomade uses a unique design aligned with sustainability values and the natural environment.</w:t>
+      </w:r>
+    </w:p>
+    <w:p>
+      <w:r>
+        <w:rPr>
+          <w:b w:val="0"/>
+          <w:i w:val="0"/>
+          <w:sz w:val="22"/>
+        </w:rPr>
+        <w:t>After two seasons designing and camperizing vans for direct sale, the founders are now considering a new line of business: renting camperized vans. To launch it, the company has defined two service tiers, three rental periods and a survey-based willingness-to-pay analysis.</w:t>
+      </w:r>
+    </w:p>
+    <w:p>
+      <w:r>
+        <w:rPr>
+          <w:b/>
+          <w:i w:val="0"/>
+          <w:sz w:val="22"/>
+        </w:rPr>
+        <w:t>Two service tiers:</w:t>
+      </w:r>
+    </w:p>
+    <w:p>
+      <w:pPr>
+        <w:pStyle w:val="ListBullet"/>
+      </w:pPr>
+      <w:r>
+        <w:t>Standard Camper Rental — base conversion with proven kitchen + bed package.</w:t>
+      </w:r>
+    </w:p>
+    <w:p>
+      <w:pPr>
+        <w:pStyle w:val="ListBullet"/>
+      </w:pPr>
+      <w:r>
+        <w:t>Premium Camper Rental — hybrid model, extra bed, indoor shower, air conditioning, solar power, extra kitchenware.</w:t>
+      </w:r>
+    </w:p>
+    <w:p>
+      <w:r>
+        <w:rPr>
+          <w:b/>
+          <w:i w:val="0"/>
+          <w:sz w:val="22"/>
+        </w:rPr>
+        <w:t>Three rental periods:</w:t>
+      </w:r>
+    </w:p>
+    <w:p>
+      <w:pPr>
+        <w:pStyle w:val="ListBullet"/>
+      </w:pPr>
+      <w:r>
+        <w:t>Day — single-day rental.</w:t>
+      </w:r>
+    </w:p>
+    <w:p>
+      <w:pPr>
+        <w:pStyle w:val="ListBullet"/>
+      </w:pPr>
+      <w:r>
+        <w:t>Weekend — 2 nights.</w:t>
+      </w:r>
+    </w:p>
+    <w:p>
+      <w:pPr>
+        <w:pStyle w:val="ListBullet"/>
+      </w:pPr>
+      <w:r>
+        <w:t>Week — 6 nights.</w:t>
+      </w:r>
+    </w:p>
+    <w:p>
+      <w:r>
+        <w:rPr>
+          <w:b w:val="0"/>
+          <w:i/>
+          <w:color w:val="64748B"/>
+          <w:sz w:val="22"/>
+        </w:rPr>
+        <w:t>The combination of tiers × periods defines a 2 × 3 price structure.</w:t>
+      </w:r>
+    </w:p>
+    <w:p>
+      <w:r>
+        <w:rPr>
+          <w:b w:val="0"/>
+          <w:i w:val="0"/>
+          <w:sz w:val="22"/>
+        </w:rPr>
+        <w:t>To calibrate willingness-to-pay, Nomade surveyed 95 people, asking about demographics, travel habits and the maximum price they would be willing to pay in each of the six rental scenarios. The marketing department also identified three competitors in the relevant market — Further VAN, People Camper and Ocean Vans — currently publishing daily tariffs only.</w:t>
+      </w:r>
+    </w:p>
+    <w:p>
+      <w:pPr>
+        <w:pStyle w:val="Heading1"/>
+      </w:pPr>
+      <w:r>
+        <w:rPr>
+          <w:color w:val="0F172A"/>
+        </w:rPr>
+        <w:t>2. Company summary — Nomade vs. market</w:t>
       </w:r>
     </w:p>
     <w:p>
@@ -345,7 +457,7 @@
         <w:rPr>
           <w:color w:val="0F172A"/>
         </w:rPr>
-        <w:t>2. Data available</w:t>
+        <w:t>3. Data available</w:t>
       </w:r>
     </w:p>
     <w:p>
@@ -356,7 +468,7 @@
         <w:rPr>
           <w:color w:val="0F172A"/>
         </w:rPr>
-        <w:t>2.1 Survey — Standard camper (WTP)</w:t>
+        <w:t>3.1 Survey — Standard camper (WTP)</w:t>
       </w:r>
     </w:p>
     <w:p>
@@ -1027,7 +1139,7 @@
         <w:rPr>
           <w:color w:val="0F172A"/>
         </w:rPr>
-        <w:t>2.2 Survey — Premium camper (WTP)</w:t>
+        <w:t>3.2 Survey — Premium camper (WTP)</w:t>
       </w:r>
     </w:p>
     <w:p>
@@ -1824,7 +1936,7 @@
         <w:rPr>
           <w:color w:val="0F172A"/>
         </w:rPr>
-        <w:t>2.3 Cost structure</w:t>
+        <w:t>3.3 Cost structure</w:t>
       </w:r>
     </w:p>
     <w:tbl>
@@ -2029,7 +2141,7 @@
         <w:rPr>
           <w:color w:val="0F172A"/>
         </w:rPr>
-        <w:t>2.4 Competitor data (daily tariffs only)</w:t>
+        <w:t>3.4 Competitor data (daily tariffs only)</w:t>
       </w:r>
     </w:p>
     <w:tbl>
@@ -2485,7 +2597,7 @@
         <w:rPr>
           <w:color w:val="0F172A"/>
         </w:rPr>
-        <w:t>3. Using the interactive simulator</w:t>
+        <w:t>4. Using the interactive simulator</w:t>
       </w:r>
     </w:p>
     <w:p>
@@ -2577,7 +2689,7 @@
         <w:rPr>
           <w:color w:val="0F172A"/>
         </w:rPr>
-        <w:t>4. Strategic framework — the 4 scenarios</w:t>
+        <w:t>5. Strategic framework — the 4 scenarios</w:t>
       </w:r>
     </w:p>
     <w:p>
@@ -3065,7 +3177,7 @@
         <w:rPr>
           <w:color w:val="0F172A"/>
         </w:rPr>
-        <w:t>5. Case questions</w:t>
+        <w:t>6. Case questions</w:t>
       </w:r>
     </w:p>
     <w:p>
@@ -3645,7 +3757,7 @@
         <w:rPr>
           <w:color w:val="0F172A"/>
         </w:rPr>
-        <w:t>6. Evaluation criteria</w:t>
+        <w:t>7. Evaluation criteria</w:t>
       </w:r>
     </w:p>
     <w:p>

</xml_diff>